<commit_message>
Replace the invented testimonials with real Google reviews
Six genuine reviews from the studio's Google Business listing, quoted verbatim —
an ellipsis marks where a longer one was trimmed and nothing has been reworded.
Attributed as first name plus last initial, with a line of context about what
each basket was for. Four more are unused if a different mix is wanted.

Added a truthful aggregate ("Rated 5.0 from 14 reviews on Google") with a note
in the pattern that it's a snapshot and should be updated or removed rather than
left to go stale.

CONTENT.md and the Word copy doc both told the client the reviews were fabricated
and had to go before launch. That's no longer true, so both are updated —
leaving a false warning in a client-facing document is its own problem.

Co-Authored-By: Claude Opus 5 <noreply@anthropic.com>
</commit_message>
<xml_diff>
--- a/Happy Turtle - Website Copy.docx
+++ b/Happy Turtle - Website Copy.docx
@@ -81,19 +81,19 @@
           <w:sz w:val="22"/>
           <w:szCs w:val="22"/>
         </w:rPr>
-        <w:t xml:space="preserve">The most important is the reviews — all three are made up. Publishing invented testimonials carries FTC penalties in the US, so those need replacing with real customer words before the site goes public, even if that means starting with just one.</w:t>
-      </w:r>
-    </w:p>
-    <w:p>
-      <w:pPr>
-        <w:spacing w:after="60"/>
-      </w:pPr>
-      <w:r>
-        <w:rPr>
-          <w:sz w:val="22"/>
-          <w:szCs w:val="22"/>
-        </w:rPr>
-        <w:t xml:space="preserve">Also invented: all prices, all basket contents, the turnaround times, and the basket names.</w:t>
+        <w:t xml:space="preserve">Invented, and still needing your words: all prices, all basket contents, the turnaround times, and the basket names.</w:t>
+      </w:r>
+    </w:p>
+    <w:p>
+      <w:pPr>
+        <w:spacing w:after="60"/>
+      </w:pPr>
+      <w:r>
+        <w:rPr>
+          <w:sz w:val="22"/>
+          <w:szCs w:val="22"/>
+        </w:rPr>
+        <w:t xml:space="preserve">The reviews are real. Six have been taken from your Google listing and quoted word for word — nothing reworded.</w:t>
       </w:r>
     </w:p>
     <w:p>
@@ -1738,109 +1738,19 @@
           <w:sz w:val="19"/>
           <w:szCs w:val="19"/>
         </w:rPr>
-        <w:t xml:space="preserve">Review 1</w:t>
-      </w:r>
-    </w:p>
-    <w:p>
-      <w:pPr>
-        <w:spacing w:after="60"/>
-      </w:pPr>
-      <w:r>
-        <w:rPr>
-          <w:sz w:val="22"/>
-          <w:szCs w:val="22"/>
-        </w:rPr>
-        <w:t xml:space="preserve">“The basket was beautiful. My daughter's teacher actually cried when she opened it.”</w:t>
-      </w:r>
-    </w:p>
-    <w:p>
-      <w:pPr>
-        <w:spacing w:after="60"/>
-      </w:pPr>
-      <w:r>
-        <w:rPr>
-          <w:sz w:val="22"/>
-          <w:szCs w:val="22"/>
-        </w:rPr>
-        <w:t xml:space="preserve">— Sarah M.</w:t>
-      </w:r>
-    </w:p>
-    <w:p>
-      <w:pPr>
-        <w:spacing w:after="20" w:before="140"/>
-      </w:pPr>
-      <w:r>
-        <w:rPr>
-          <w:b/>
-          <w:bCs/>
-          <w:color w:val="444444"/>
-          <w:sz w:val="19"/>
-          <w:szCs w:val="19"/>
-        </w:rPr>
-        <w:t xml:space="preserve">Review 2</w:t>
-      </w:r>
-    </w:p>
-    <w:p>
-      <w:pPr>
-        <w:spacing w:after="60"/>
-      </w:pPr>
-      <w:r>
-        <w:rPr>
-          <w:sz w:val="22"/>
-          <w:szCs w:val="22"/>
-        </w:rPr>
-        <w:t xml:space="preserve">“Ordered baskets for the whole bridal party. The contents list came back the same day.”</w:t>
-      </w:r>
-    </w:p>
-    <w:p>
-      <w:pPr>
-        <w:spacing w:after="60"/>
-      </w:pPr>
-      <w:r>
-        <w:rPr>
-          <w:sz w:val="22"/>
-          <w:szCs w:val="22"/>
-        </w:rPr>
-        <w:t xml:space="preserve">— Priya R.</w:t>
-      </w:r>
-    </w:p>
-    <w:p>
-      <w:pPr>
-        <w:spacing w:after="20" w:before="140"/>
-      </w:pPr>
-      <w:r>
-        <w:rPr>
-          <w:b/>
-          <w:bCs/>
-          <w:color w:val="444444"/>
-          <w:sz w:val="19"/>
-          <w:szCs w:val="19"/>
-        </w:rPr>
-        <w:t xml:space="preserve">Review 3</w:t>
-      </w:r>
-    </w:p>
-    <w:p>
-      <w:pPr>
-        <w:spacing w:after="60"/>
-      </w:pPr>
-      <w:r>
-        <w:rPr>
-          <w:sz w:val="22"/>
-          <w:szCs w:val="22"/>
-        </w:rPr>
-        <w:t xml:space="preserve">“Everything inside was lovely and the wrapping meant I could gift it as-is.”</w:t>
-      </w:r>
-    </w:p>
-    <w:p>
-      <w:pPr>
-        <w:spacing w:after="60"/>
-      </w:pPr>
-      <w:r>
-        <w:rPr>
-          <w:sz w:val="22"/>
-          <w:szCs w:val="22"/>
-        </w:rPr>
-        <w:t xml:space="preserve">— Daniel K.</w:t>
+        <w:t xml:space="preserve">Under the heading</w:t>
+      </w:r>
+    </w:p>
+    <w:p>
+      <w:pPr>
+        <w:spacing w:after="60"/>
+      </w:pPr>
+      <w:r>
+        <w:rPr>
+          <w:sz w:val="22"/>
+          <w:szCs w:val="22"/>
+        </w:rPr>
+        <w:t xml:space="preserve">Rated 5.0 from 14 reviews on Google.</w:t>
       </w:r>
     </w:p>
     <w:p>
@@ -1851,11 +1761,275 @@
         <w:rPr>
           <w:i/>
           <w:iCs/>
-          <w:color w:val="8A3324"/>
-          <w:sz w:val="19"/>
-          <w:szCs w:val="19"/>
-        </w:rPr>
-        <w:t xml:space="preserve">All three reviews are invented — these people don't exist and never said this. Replace with real customer words before launch. For each you'll need: the quote, a first name and last initial, and optionally what the basket was for.</w:t>
+          <w:color w:val="555555"/>
+          <w:sz w:val="19"/>
+          <w:szCs w:val="19"/>
+        </w:rPr>
+        <w:t xml:space="preserve">A snapshot taken when these were added — update it as the count grows, or drop it. An out-of-date figure is worse than none.</w:t>
+      </w:r>
+    </w:p>
+    <w:p>
+      <w:pPr>
+        <w:spacing w:after="100"/>
+      </w:pPr>
+      <w:r>
+        <w:rPr>
+          <w:i/>
+          <w:iCs/>
+          <w:color w:val="555555"/>
+          <w:sz w:val="19"/>
+          <w:szCs w:val="19"/>
+        </w:rPr>
+        <w:t xml:space="preserve">The six reviews below are real, taken from your Google listing and quoted verbatim. An ellipsis marks where a longer review was trimmed; nothing has been reworded.</w:t>
+      </w:r>
+    </w:p>
+    <w:p>
+      <w:pPr>
+        <w:spacing w:after="20" w:before="140"/>
+      </w:pPr>
+      <w:r>
+        <w:rPr>
+          <w:b/>
+          <w:bCs/>
+          <w:color w:val="444444"/>
+          <w:sz w:val="19"/>
+          <w:szCs w:val="19"/>
+        </w:rPr>
+        <w:t xml:space="preserve">Review 1</w:t>
+      </w:r>
+    </w:p>
+    <w:p>
+      <w:pPr>
+        <w:spacing w:after="60"/>
+      </w:pPr>
+      <w:r>
+        <w:rPr>
+          <w:sz w:val="22"/>
+          <w:szCs w:val="22"/>
+        </w:rPr>
+        <w:t xml:space="preserve">“The custom made gift basket we received from Joyce for our new grandson was perfection! Down to the very last detail, of which there were many, was beyond expectation.”</w:t>
+      </w:r>
+    </w:p>
+    <w:p>
+      <w:pPr>
+        <w:spacing w:after="60"/>
+      </w:pPr>
+      <w:r>
+        <w:rPr>
+          <w:sz w:val="22"/>
+          <w:szCs w:val="22"/>
+        </w:rPr>
+        <w:t xml:space="preserve">— Rebecca S. · a basket for a new grandson</w:t>
+      </w:r>
+    </w:p>
+    <w:p>
+      <w:pPr>
+        <w:spacing w:after="20" w:before="140"/>
+      </w:pPr>
+      <w:r>
+        <w:rPr>
+          <w:b/>
+          <w:bCs/>
+          <w:color w:val="444444"/>
+          <w:sz w:val="19"/>
+          <w:szCs w:val="19"/>
+        </w:rPr>
+        <w:t xml:space="preserve">Review 2</w:t>
+      </w:r>
+    </w:p>
+    <w:p>
+      <w:pPr>
+        <w:spacing w:after="60"/>
+      </w:pPr>
+      <w:r>
+        <w:rPr>
+          <w:sz w:val="22"/>
+          <w:szCs w:val="22"/>
+        </w:rPr>
+        <w:t xml:space="preserve">“The attention to detail, quality of the items, and beautiful presentation blew us both away. It’s so hard to find truly unique, high-quality custom gifts these days, but Happy Turtle nailed it.”</w:t>
+      </w:r>
+    </w:p>
+    <w:p>
+      <w:pPr>
+        <w:spacing w:after="60"/>
+      </w:pPr>
+      <w:r>
+        <w:rPr>
+          <w:sz w:val="22"/>
+          <w:szCs w:val="22"/>
+        </w:rPr>
+        <w:t xml:space="preserve">— Jennie K. · a new baby gift</w:t>
+      </w:r>
+    </w:p>
+    <w:p>
+      <w:pPr>
+        <w:spacing w:after="20" w:before="140"/>
+      </w:pPr>
+      <w:r>
+        <w:rPr>
+          <w:b/>
+          <w:bCs/>
+          <w:color w:val="444444"/>
+          <w:sz w:val="19"/>
+          <w:szCs w:val="19"/>
+        </w:rPr>
+        <w:t xml:space="preserve">Review 3</w:t>
+      </w:r>
+    </w:p>
+    <w:p>
+      <w:pPr>
+        <w:spacing w:after="60"/>
+      </w:pPr>
+      <w:r>
+        <w:rPr>
+          <w:sz w:val="22"/>
+          <w:szCs w:val="22"/>
+        </w:rPr>
+        <w:t xml:space="preserve">“The packages were huge and impressive, overflowing with high-quality items all beautifully packaged together… I have to think that anyone receiving a Happy Turtle package will feel lucky and appreciated!”</w:t>
+      </w:r>
+    </w:p>
+    <w:p>
+      <w:pPr>
+        <w:spacing w:after="60"/>
+      </w:pPr>
+      <w:r>
+        <w:rPr>
+          <w:sz w:val="22"/>
+          <w:szCs w:val="22"/>
+        </w:rPr>
+        <w:t xml:space="preserve">— Eric K. · received two baskets</w:t>
+      </w:r>
+    </w:p>
+    <w:p>
+      <w:pPr>
+        <w:spacing w:after="20" w:before="140"/>
+      </w:pPr>
+      <w:r>
+        <w:rPr>
+          <w:b/>
+          <w:bCs/>
+          <w:color w:val="444444"/>
+          <w:sz w:val="19"/>
+          <w:szCs w:val="19"/>
+        </w:rPr>
+        <w:t xml:space="preserve">Review 4</w:t>
+      </w:r>
+    </w:p>
+    <w:p>
+      <w:pPr>
+        <w:spacing w:after="60"/>
+      </w:pPr>
+      <w:r>
+        <w:rPr>
+          <w:sz w:val="22"/>
+          <w:szCs w:val="22"/>
+        </w:rPr>
+        <w:t xml:space="preserve">“I told Joyce a little about each client, my budget, and some preferences I had and she took care of the curating, the building, decorating, delivering and made each one perfect!”</w:t>
+      </w:r>
+    </w:p>
+    <w:p>
+      <w:pPr>
+        <w:spacing w:after="60"/>
+      </w:pPr>
+      <w:r>
+        <w:rPr>
+          <w:sz w:val="22"/>
+          <w:szCs w:val="22"/>
+        </w:rPr>
+        <w:t xml:space="preserve">— Carmen M. · client gifts for a realtor</w:t>
+      </w:r>
+    </w:p>
+    <w:p>
+      <w:pPr>
+        <w:spacing w:after="20" w:before="140"/>
+      </w:pPr>
+      <w:r>
+        <w:rPr>
+          <w:b/>
+          <w:bCs/>
+          <w:color w:val="444444"/>
+          <w:sz w:val="19"/>
+          <w:szCs w:val="19"/>
+        </w:rPr>
+        <w:t xml:space="preserve">Review 5</w:t>
+      </w:r>
+    </w:p>
+    <w:p>
+      <w:pPr>
+        <w:spacing w:after="60"/>
+      </w:pPr>
+      <w:r>
+        <w:rPr>
+          <w:sz w:val="22"/>
+          <w:szCs w:val="22"/>
+        </w:rPr>
+        <w:t xml:space="preserve">“We adored our gift basket and were blown away by all of the little details. We are so grateful for the custom gifts made special for our son and will cherish them forever!”</w:t>
+      </w:r>
+    </w:p>
+    <w:p>
+      <w:pPr>
+        <w:spacing w:after="60"/>
+      </w:pPr>
+      <w:r>
+        <w:rPr>
+          <w:sz w:val="22"/>
+          <w:szCs w:val="22"/>
+        </w:rPr>
+        <w:t xml:space="preserve">— Katie M. · custom gifts for her son</w:t>
+      </w:r>
+    </w:p>
+    <w:p>
+      <w:pPr>
+        <w:spacing w:after="20" w:before="140"/>
+      </w:pPr>
+      <w:r>
+        <w:rPr>
+          <w:b/>
+          <w:bCs/>
+          <w:color w:val="444444"/>
+          <w:sz w:val="19"/>
+          <w:szCs w:val="19"/>
+        </w:rPr>
+        <w:t xml:space="preserve">Review 6</w:t>
+      </w:r>
+    </w:p>
+    <w:p>
+      <w:pPr>
+        <w:spacing w:after="60"/>
+      </w:pPr>
+      <w:r>
+        <w:rPr>
+          <w:sz w:val="22"/>
+          <w:szCs w:val="22"/>
+        </w:rPr>
+        <w:t xml:space="preserve">“Joyce does a wonderful job creating these gifts, often tailoring baby baskets with a theme, and a beautiful job wrapping them up that gives the receiver that “WOW” feeling!”</w:t>
+      </w:r>
+    </w:p>
+    <w:p>
+      <w:pPr>
+        <w:spacing w:after="60"/>
+      </w:pPr>
+      <w:r>
+        <w:rPr>
+          <w:sz w:val="22"/>
+          <w:szCs w:val="22"/>
+        </w:rPr>
+        <w:t xml:space="preserve">— Vivian S. · repeat customer</w:t>
+      </w:r>
+    </w:p>
+    <w:p>
+      <w:pPr>
+        <w:spacing w:after="100"/>
+      </w:pPr>
+      <w:r>
+        <w:rPr>
+          <w:i/>
+          <w:iCs/>
+          <w:color w:val="555555"/>
+          <w:sz w:val="19"/>
+          <w:szCs w:val="19"/>
+        </w:rPr>
+        <w:t xml:space="preserve">Attribution is first name plus last initial. The full names are public on Google if you’d rather show them. Four more good reviews are unused — Sarah T., Melanie K., Kathleen I. and Jennifer N. — if you want a different mix.</w:t>
       </w:r>
     </w:p>
     <w:p>

</xml_diff>

<commit_message>
Take prices off the baskets
The size-and-price list was invented, and it sat oddly against a site that
says everywhere else that baskets are custom and quoted per enquiry. Out of
the editor skeleton, out of the five demo baskets, out of the static mirror
and the copy document.

Co-Authored-By: Claude Opus 5 <noreply@anthropic.com>
</commit_message>
<xml_diff>
--- a/Happy Turtle - Website Copy.docx
+++ b/Happy Turtle - Website Copy.docx
@@ -81,7 +81,7 @@
           <w:sz w:val="22"/>
           <w:szCs w:val="22"/>
         </w:rPr>
-        <w:t xml:space="preserve">Invented, and still needing your words: all prices, all basket contents, the turnaround times, and the basket names.</w:t>
+        <w:t xml:space="preserve">Invented, and still needing your words: all basket contents, the turnaround times, and the basket names.</w:t>
       </w:r>
     </w:p>
     <w:p>
@@ -2354,33 +2354,6 @@
           <w:sz w:val="19"/>
           <w:szCs w:val="19"/>
         </w:rPr>
-        <w:t xml:space="preserve">Section heading</w:t>
-      </w:r>
-    </w:p>
-    <w:p>
-      <w:pPr>
-        <w:spacing w:after="60"/>
-      </w:pPr>
-      <w:r>
-        <w:rPr>
-          <w:sz w:val="22"/>
-          <w:szCs w:val="22"/>
-        </w:rPr>
-        <w:t xml:space="preserve">Size &amp; Price Guide</w:t>
-      </w:r>
-    </w:p>
-    <w:p>
-      <w:pPr>
-        <w:spacing w:after="20" w:before="140"/>
-      </w:pPr>
-      <w:r>
-        <w:rPr>
-          <w:b/>
-          <w:bCs/>
-          <w:color w:val="444444"/>
-          <w:sz w:val="19"/>
-          <w:szCs w:val="19"/>
-        </w:rPr>
         <w:t xml:space="preserve">Button</w:t>
       </w:r>
     </w:p>
@@ -2471,7 +2444,7 @@
           <w:sz w:val="19"/>
           <w:szCs w:val="19"/>
         </w:rPr>
-        <w:t xml:space="preserve">Every name, description, contents list and price below is invented. I wrote them from looking at your photographs. Please replace with the real details, or tell me which baskets to show instead.</w:t>
+        <w:t xml:space="preserve">Every name, description and contents list below is invented. I wrote them from looking at your photographs. Please replace with the real details, or tell me which baskets to show instead.</w:t>
       </w:r>
     </w:p>
     <w:p>
@@ -2644,72 +2617,6 @@
     </w:p>
     <w:p>
       <w:pPr>
-        <w:spacing w:after="20" w:before="140"/>
-      </w:pPr>
-      <w:r>
-        <w:rPr>
-          <w:b/>
-          <w:bCs/>
-          <w:color w:val="444444"/>
-          <w:sz w:val="19"/>
-          <w:szCs w:val="19"/>
-        </w:rPr>
-        <w:t xml:space="preserve">Size &amp; price guide</w:t>
-      </w:r>
-    </w:p>
-    <w:p>
-      <w:pPr>
-        <w:pStyle w:val="ListParagraph"/>
-        <w:numPr>
-          <w:ilvl w:val="0"/>
-          <w:numId w:val="1"/>
-        </w:numPr>
-        <w:spacing w:after="40"/>
-      </w:pPr>
-      <w:r>
-        <w:rPr>
-          <w:sz w:val="22"/>
-          <w:szCs w:val="22"/>
-        </w:rPr>
-        <w:t xml:space="preserve">Small — from $65</w:t>
-      </w:r>
-    </w:p>
-    <w:p>
-      <w:pPr>
-        <w:pStyle w:val="ListParagraph"/>
-        <w:numPr>
-          <w:ilvl w:val="0"/>
-          <w:numId w:val="1"/>
-        </w:numPr>
-        <w:spacing w:after="40"/>
-      </w:pPr>
-      <w:r>
-        <w:rPr>
-          <w:sz w:val="22"/>
-          <w:szCs w:val="22"/>
-        </w:rPr>
-        <w:t xml:space="preserve">Medium — from $95</w:t>
-      </w:r>
-    </w:p>
-    <w:p>
-      <w:pPr>
-        <w:pStyle w:val="ListParagraph"/>
-        <w:numPr>
-          <w:ilvl w:val="0"/>
-          <w:numId w:val="1"/>
-        </w:numPr>
-        <w:spacing w:after="40"/>
-      </w:pPr>
-      <w:r>
-        <w:rPr>
-          <w:sz w:val="22"/>
-          <w:szCs w:val="22"/>
-        </w:rPr>
-        <w:t xml:space="preserve">Large — from $130</w:t>
-      </w:r>
-    </w:p>
-    <w:p>
-      <w:pPr>
         <w:spacing w:after="60" w:before="220"/>
       </w:pPr>
       <w:r>
@@ -2878,72 +2785,6 @@
     </w:p>
     <w:p>
       <w:pPr>
-        <w:spacing w:after="20" w:before="140"/>
-      </w:pPr>
-      <w:r>
-        <w:rPr>
-          <w:b/>
-          <w:bCs/>
-          <w:color w:val="444444"/>
-          <w:sz w:val="19"/>
-          <w:szCs w:val="19"/>
-        </w:rPr>
-        <w:t xml:space="preserve">Size &amp; price guide</w:t>
-      </w:r>
-    </w:p>
-    <w:p>
-      <w:pPr>
-        <w:pStyle w:val="ListParagraph"/>
-        <w:numPr>
-          <w:ilvl w:val="0"/>
-          <w:numId w:val="1"/>
-        </w:numPr>
-        <w:spacing w:after="40"/>
-      </w:pPr>
-      <w:r>
-        <w:rPr>
-          <w:sz w:val="22"/>
-          <w:szCs w:val="22"/>
-        </w:rPr>
-        <w:t xml:space="preserve">Small — from $65</w:t>
-      </w:r>
-    </w:p>
-    <w:p>
-      <w:pPr>
-        <w:pStyle w:val="ListParagraph"/>
-        <w:numPr>
-          <w:ilvl w:val="0"/>
-          <w:numId w:val="1"/>
-        </w:numPr>
-        <w:spacing w:after="40"/>
-      </w:pPr>
-      <w:r>
-        <w:rPr>
-          <w:sz w:val="22"/>
-          <w:szCs w:val="22"/>
-        </w:rPr>
-        <w:t xml:space="preserve">Medium — from $95</w:t>
-      </w:r>
-    </w:p>
-    <w:p>
-      <w:pPr>
-        <w:pStyle w:val="ListParagraph"/>
-        <w:numPr>
-          <w:ilvl w:val="0"/>
-          <w:numId w:val="1"/>
-        </w:numPr>
-        <w:spacing w:after="40"/>
-      </w:pPr>
-      <w:r>
-        <w:rPr>
-          <w:sz w:val="22"/>
-          <w:szCs w:val="22"/>
-        </w:rPr>
-        <w:t xml:space="preserve">Large — from $130</w:t>
-      </w:r>
-    </w:p>
-    <w:p>
-      <w:pPr>
         <w:spacing w:after="60" w:before="220"/>
       </w:pPr>
       <w:r>
@@ -3112,72 +2953,6 @@
     </w:p>
     <w:p>
       <w:pPr>
-        <w:spacing w:after="20" w:before="140"/>
-      </w:pPr>
-      <w:r>
-        <w:rPr>
-          <w:b/>
-          <w:bCs/>
-          <w:color w:val="444444"/>
-          <w:sz w:val="19"/>
-          <w:szCs w:val="19"/>
-        </w:rPr>
-        <w:t xml:space="preserve">Size &amp; price guide</w:t>
-      </w:r>
-    </w:p>
-    <w:p>
-      <w:pPr>
-        <w:pStyle w:val="ListParagraph"/>
-        <w:numPr>
-          <w:ilvl w:val="0"/>
-          <w:numId w:val="1"/>
-        </w:numPr>
-        <w:spacing w:after="40"/>
-      </w:pPr>
-      <w:r>
-        <w:rPr>
-          <w:sz w:val="22"/>
-          <w:szCs w:val="22"/>
-        </w:rPr>
-        <w:t xml:space="preserve">Small — from $65</w:t>
-      </w:r>
-    </w:p>
-    <w:p>
-      <w:pPr>
-        <w:pStyle w:val="ListParagraph"/>
-        <w:numPr>
-          <w:ilvl w:val="0"/>
-          <w:numId w:val="1"/>
-        </w:numPr>
-        <w:spacing w:after="40"/>
-      </w:pPr>
-      <w:r>
-        <w:rPr>
-          <w:sz w:val="22"/>
-          <w:szCs w:val="22"/>
-        </w:rPr>
-        <w:t xml:space="preserve">Medium — from $95</w:t>
-      </w:r>
-    </w:p>
-    <w:p>
-      <w:pPr>
-        <w:pStyle w:val="ListParagraph"/>
-        <w:numPr>
-          <w:ilvl w:val="0"/>
-          <w:numId w:val="1"/>
-        </w:numPr>
-        <w:spacing w:after="40"/>
-      </w:pPr>
-      <w:r>
-        <w:rPr>
-          <w:sz w:val="22"/>
-          <w:szCs w:val="22"/>
-        </w:rPr>
-        <w:t xml:space="preserve">Large — from $130</w:t>
-      </w:r>
-    </w:p>
-    <w:p>
-      <w:pPr>
         <w:spacing w:after="60" w:before="220"/>
       </w:pPr>
       <w:r>
@@ -3346,72 +3121,6 @@
     </w:p>
     <w:p>
       <w:pPr>
-        <w:spacing w:after="20" w:before="140"/>
-      </w:pPr>
-      <w:r>
-        <w:rPr>
-          <w:b/>
-          <w:bCs/>
-          <w:color w:val="444444"/>
-          <w:sz w:val="19"/>
-          <w:szCs w:val="19"/>
-        </w:rPr>
-        <w:t xml:space="preserve">Size &amp; price guide</w:t>
-      </w:r>
-    </w:p>
-    <w:p>
-      <w:pPr>
-        <w:pStyle w:val="ListParagraph"/>
-        <w:numPr>
-          <w:ilvl w:val="0"/>
-          <w:numId w:val="1"/>
-        </w:numPr>
-        <w:spacing w:after="40"/>
-      </w:pPr>
-      <w:r>
-        <w:rPr>
-          <w:sz w:val="22"/>
-          <w:szCs w:val="22"/>
-        </w:rPr>
-        <w:t xml:space="preserve">Small — from $65</w:t>
-      </w:r>
-    </w:p>
-    <w:p>
-      <w:pPr>
-        <w:pStyle w:val="ListParagraph"/>
-        <w:numPr>
-          <w:ilvl w:val="0"/>
-          <w:numId w:val="1"/>
-        </w:numPr>
-        <w:spacing w:after="40"/>
-      </w:pPr>
-      <w:r>
-        <w:rPr>
-          <w:sz w:val="22"/>
-          <w:szCs w:val="22"/>
-        </w:rPr>
-        <w:t xml:space="preserve">Medium — from $95</w:t>
-      </w:r>
-    </w:p>
-    <w:p>
-      <w:pPr>
-        <w:pStyle w:val="ListParagraph"/>
-        <w:numPr>
-          <w:ilvl w:val="0"/>
-          <w:numId w:val="1"/>
-        </w:numPr>
-        <w:spacing w:after="40"/>
-      </w:pPr>
-      <w:r>
-        <w:rPr>
-          <w:sz w:val="22"/>
-          <w:szCs w:val="22"/>
-        </w:rPr>
-        <w:t xml:space="preserve">Large — from $130</w:t>
-      </w:r>
-    </w:p>
-    <w:p>
-      <w:pPr>
         <w:spacing w:after="60" w:before="220"/>
       </w:pPr>
       <w:r>
@@ -3576,72 +3285,6 @@
           <w:szCs w:val="22"/>
         </w:rPr>
         <w:t xml:space="preserve">Chocolate treats</w:t>
-      </w:r>
-    </w:p>
-    <w:p>
-      <w:pPr>
-        <w:spacing w:after="20" w:before="140"/>
-      </w:pPr>
-      <w:r>
-        <w:rPr>
-          <w:b/>
-          <w:bCs/>
-          <w:color w:val="444444"/>
-          <w:sz w:val="19"/>
-          <w:szCs w:val="19"/>
-        </w:rPr>
-        <w:t xml:space="preserve">Size &amp; price guide</w:t>
-      </w:r>
-    </w:p>
-    <w:p>
-      <w:pPr>
-        <w:pStyle w:val="ListParagraph"/>
-        <w:numPr>
-          <w:ilvl w:val="0"/>
-          <w:numId w:val="1"/>
-        </w:numPr>
-        <w:spacing w:after="40"/>
-      </w:pPr>
-      <w:r>
-        <w:rPr>
-          <w:sz w:val="22"/>
-          <w:szCs w:val="22"/>
-        </w:rPr>
-        <w:t xml:space="preserve">Small — from $65</w:t>
-      </w:r>
-    </w:p>
-    <w:p>
-      <w:pPr>
-        <w:pStyle w:val="ListParagraph"/>
-        <w:numPr>
-          <w:ilvl w:val="0"/>
-          <w:numId w:val="1"/>
-        </w:numPr>
-        <w:spacing w:after="40"/>
-      </w:pPr>
-      <w:r>
-        <w:rPr>
-          <w:sz w:val="22"/>
-          <w:szCs w:val="22"/>
-        </w:rPr>
-        <w:t xml:space="preserve">Medium — from $95</w:t>
-      </w:r>
-    </w:p>
-    <w:p>
-      <w:pPr>
-        <w:pStyle w:val="ListParagraph"/>
-        <w:numPr>
-          <w:ilvl w:val="0"/>
-          <w:numId w:val="1"/>
-        </w:numPr>
-        <w:spacing w:after="40"/>
-      </w:pPr>
-      <w:r>
-        <w:rPr>
-          <w:sz w:val="22"/>
-          <w:szCs w:val="22"/>
-        </w:rPr>
-        <w:t xml:space="preserve">Large — from $130</w:t>
       </w:r>
     </w:p>
     <w:p>

</xml_diff>